<commit_message>
docs(security): documento tecnico de pruebas de seguridad de Bolsillos
- pruebas-security-bolsillos.{md,docx,pdf}: modelo de amenazas (STRIDE,
  OWASP API Top 10 2023), metodologia del curso, catalogo de 158 casos,
  hallazgos SEC-01..SEC-08 con CWE y CVSS estimado, causa raiz,
  correccion, evidencia antes/despues, riesgo residual y guion.
- Regresion y guia de sustentacion actualizadas: D-02 y D-08 corregidos
  (195 + 3 it.fails).

Co-Authored-By: Claude Opus 5.5 <noreply@anthropic.com>
</commit_message>
<xml_diff>
--- a/docs/guia-sustentacion-bolsillos.docx
+++ b/docs/guia-sustentacion-bolsillos.docx
@@ -193,6 +193,7 @@
             <w:r>
               <w:rPr>
                 <w:rFonts w:ascii="Consolas" w:hAnsi="Consolas"/>
+                <w:b w:val="0"/>
                 <w:color w:val="8B1E3F"/>
                 <w:sz w:val="17"/>
               </w:rPr>
@@ -207,6 +208,7 @@
             <w:r>
               <w:rPr>
                 <w:rFonts w:ascii="Consolas" w:hAnsi="Consolas"/>
+                <w:b w:val="0"/>
                 <w:color w:val="8B1E3F"/>
                 <w:sz w:val="17"/>
               </w:rPr>
@@ -256,6 +258,7 @@
             <w:r>
               <w:rPr>
                 <w:rFonts w:ascii="Consolas" w:hAnsi="Consolas"/>
+                <w:b w:val="0"/>
                 <w:color w:val="8B1E3F"/>
                 <w:sz w:val="17"/>
               </w:rPr>
@@ -321,9 +324,52 @@
     </w:p>
     <w:p>
       <w:pPr>
+        <w:ind w:left="216"/>
+        <w:shd w:val="clear" w:color="auto" w:fill="FFF8E5"/>
+        <w:pBdr>
+          <w:left w:val="single" w:sz="18" w:space="6" w:color="E0A800"/>
+        </w:pBdr>
+      </w:pPr>
+      <w:r>
+        <w:rPr>
+          <w:b/>
+        </w:rPr>
+        <w:t>Actualización (2026-10-08):</w:t>
+      </w:r>
+      <w:r>
+        <w:rPr/>
+        <w:t xml:space="preserve"> se añadieron pruebas de seguridad (ver </w:t>
+      </w:r>
+      <w:r>
+        <w:rPr>
+          <w:rFonts w:ascii="Consolas" w:hAnsi="Consolas"/>
+          <w:b w:val="0"/>
+          <w:color w:val="8B1E3F"/>
+          <w:sz w:val="19"/>
+        </w:rPr>
+        <w:t>pruebas-security-bolsillos.md</w:t>
+      </w:r>
+      <w:r>
+        <w:rPr/>
+        <w:t xml:space="preserve">) y su refactor corrigió D-02 y D-08. La regresión queda en </w:t>
+      </w:r>
+      <w:r>
+        <w:rPr>
+          <w:b/>
+        </w:rPr>
+        <w:t>195 aprobadas + 3 defectos conocidos</w:t>
+      </w:r>
+      <w:r>
+        <w:rPr/>
+        <w:t>; las cifras de la demo ya están actualizadas. La comparación antes/después de la sección 6 es la medición original.</w:t>
+      </w:r>
+    </w:p>
+    <w:p>
+      <w:pPr>
         <w:pStyle w:val="Heading1"/>
       </w:pPr>
       <w:r>
+        <w:rPr/>
         <w:t>1. Qué hice, en 30 segundos</w:t>
       </w:r>
     </w:p>
@@ -337,6 +383,7 @@
         <w:spacing w:after="60"/>
       </w:pPr>
       <w:r>
+        <w:rPr/>
         <w:t xml:space="preserve">Elegí </w:t>
       </w:r>
       <w:r>
@@ -346,6 +393,7 @@
         <w:t>seis funcionalidades</w:t>
       </w:r>
       <w:r>
+        <w:rPr/>
         <w:t xml:space="preserve">: crear, consultar, actualizar, eliminar y transferir bolsillos, más </w:t>
       </w:r>
       <w:r>
@@ -355,6 +403,7 @@
         <w:t>depositar dinero</w:t>
       </w:r>
       <w:r>
+        <w:rPr/>
         <w:t>. Revisé el repositorio para que ninguna la estuviera trabajando un compañero.</w:t>
       </w:r>
     </w:p>
@@ -368,6 +417,7 @@
         <w:spacing w:after="60"/>
       </w:pPr>
       <w:r>
+        <w:rPr/>
         <w:t xml:space="preserve">Construí una </w:t>
       </w:r>
       <w:r>
@@ -377,6 +427,7 @@
         <w:t>suite de regresión de 94 casos</w:t>
       </w:r>
       <w:r>
+        <w:rPr/>
         <w:t xml:space="preserve"> que prueba las seis </w:t>
       </w:r>
       <w:r>
@@ -386,17 +437,20 @@
         <w:t>a través de la API HTTP real</w:t>
       </w:r>
       <w:r>
+        <w:rPr/>
         <w:t xml:space="preserve"> con supertest, siguiendo el patrón que usa el equipo en autenticación (</w:t>
       </w:r>
       <w:r>
         <w:rPr>
           <w:rFonts w:ascii="Consolas" w:hAnsi="Consolas"/>
+          <w:b w:val="0"/>
           <w:color w:val="8B1E3F"/>
           <w:sz w:val="19"/>
         </w:rPr>
         <w:t>createTestApp</w:t>
       </w:r>
       <w:r>
+        <w:rPr/>
         <w:t>).</w:t>
       </w:r>
     </w:p>
@@ -410,6 +464,7 @@
         <w:spacing w:after="60"/>
       </w:pPr>
       <w:r>
+        <w:rPr/>
         <w:t xml:space="preserve">Escribí todas las pruebas con </w:t>
       </w:r>
       <w:r>
@@ -419,6 +474,7 @@
         <w:t>aserciones fluidas</w:t>
       </w:r>
       <w:r>
+        <w:rPr/>
         <w:t xml:space="preserve"> (Chai BDD, incluido en Vitest). Convertí las 6 suites unitarias existentes de Bolsillos (58 pruebas) y escribí 12 unitarias nuevas para el depósito.</w:t>
       </w:r>
     </w:p>
@@ -438,6 +494,7 @@
         <w:t>Demostré que la suite verifica el funcionamiento después de un cambio</w:t>
       </w:r>
       <w:r>
+        <w:rPr/>
         <w:t>:</w:t>
       </w:r>
     </w:p>
@@ -447,6 +504,7 @@
         <w:spacing w:after="60"/>
       </w:pPr>
       <w:r>
+        <w:rPr/>
         <w:t xml:space="preserve">Ejecuté las mismas </w:t>
       </w:r>
       <w:r>
@@ -456,6 +514,7 @@
         <w:t>198 pruebas</w:t>
       </w:r>
       <w:r>
+        <w:rPr/>
         <w:t xml:space="preserve"> sobre el código de antes del refactor y sobre el actual: 0 diferencias.</w:t>
       </w:r>
     </w:p>
@@ -465,6 +524,7 @@
         <w:spacing w:after="60"/>
       </w:pPr>
       <w:r>
+        <w:rPr/>
         <w:t>Rompí el código a propósito y la suite lo detectó.</w:t>
       </w:r>
     </w:p>
@@ -478,6 +538,7 @@
         <w:spacing w:after="60"/>
       </w:pPr>
       <w:r>
+        <w:rPr/>
         <w:t xml:space="preserve">Monté el trabajo </w:t>
       </w:r>
       <w:r>
@@ -487,6 +548,7 @@
         <w:t>sobre la rama del pipeline de Jenkins</w:t>
       </w:r>
       <w:r>
+        <w:rPr/>
         <w:t xml:space="preserve">, que lo ejecuta, manda la cobertura a </w:t>
       </w:r>
       <w:r>
@@ -496,6 +558,7 @@
         <w:t>SonarQube</w:t>
       </w:r>
       <w:r>
+        <w:rPr/>
         <w:t xml:space="preserve"> y construye y levanta la app con </w:t>
       </w:r>
       <w:r>
@@ -505,6 +568,7 @@
         <w:t>Docker</w:t>
       </w:r>
       <w:r>
+        <w:rPr/>
         <w:t>.</w:t>
       </w:r>
     </w:p>
@@ -521,6 +585,7 @@
         <w:pStyle w:val="Heading1"/>
       </w:pPr>
       <w:r>
+        <w:rPr/>
         <w:t>2. Mapa rúbrica → qué hice → cómo lo demuestro</w:t>
       </w:r>
     </w:p>
@@ -646,6 +711,7 @@
             <w:r>
               <w:rPr>
                 <w:rFonts w:ascii="Consolas" w:hAnsi="Consolas"/>
+                <w:b w:val="0"/>
                 <w:color w:val="8B1E3F"/>
                 <w:sz w:val="17"/>
               </w:rPr>
@@ -690,6 +756,7 @@
             <w:r>
               <w:rPr>
                 <w:rFonts w:ascii="Consolas" w:hAnsi="Consolas"/>
+                <w:b w:val="0"/>
                 <w:color w:val="8B1E3F"/>
                 <w:sz w:val="17"/>
               </w:rPr>
@@ -704,6 +771,7 @@
             <w:r>
               <w:rPr>
                 <w:rFonts w:ascii="Consolas" w:hAnsi="Consolas"/>
+                <w:b w:val="0"/>
                 <w:color w:val="8B1E3F"/>
                 <w:sz w:val="17"/>
               </w:rPr>
@@ -801,6 +869,7 @@
             <w:r>
               <w:rPr>
                 <w:rFonts w:ascii="Consolas" w:hAnsi="Consolas"/>
+                <w:b w:val="0"/>
                 <w:color w:val="8B1E3F"/>
                 <w:sz w:val="17"/>
               </w:rPr>
@@ -815,6 +884,7 @@
             <w:r>
               <w:rPr>
                 <w:rFonts w:ascii="Consolas" w:hAnsi="Consolas"/>
+                <w:b w:val="0"/>
                 <w:color w:val="8B1E3F"/>
                 <w:sz w:val="17"/>
               </w:rPr>
@@ -829,6 +899,7 @@
             <w:r>
               <w:rPr>
                 <w:rFonts w:ascii="Consolas" w:hAnsi="Consolas"/>
+                <w:b w:val="0"/>
                 <w:color w:val="8B1E3F"/>
                 <w:sz w:val="17"/>
               </w:rPr>
@@ -843,6 +914,7 @@
             <w:r>
               <w:rPr>
                 <w:rFonts w:ascii="Consolas" w:hAnsi="Consolas"/>
+                <w:b w:val="0"/>
                 <w:color w:val="8B1E3F"/>
                 <w:sz w:val="17"/>
               </w:rPr>
@@ -920,6 +992,7 @@
             <w:r>
               <w:rPr>
                 <w:rFonts w:ascii="Consolas" w:hAnsi="Consolas"/>
+                <w:b w:val="0"/>
                 <w:color w:val="8B1E3F"/>
                 <w:sz w:val="17"/>
               </w:rPr>
@@ -1016,6 +1089,7 @@
         <w:pStyle w:val="Heading1"/>
       </w:pPr>
       <w:r>
+        <w:rPr/>
         <w:t>3. Conceptos que debo dominar</w:t>
       </w:r>
     </w:p>
@@ -1181,6 +1255,7 @@
             <w:r>
               <w:rPr>
                 <w:rFonts w:ascii="Consolas" w:hAnsi="Consolas"/>
+                <w:b w:val="0"/>
                 <w:color w:val="8B1E3F"/>
                 <w:sz w:val="17"/>
               </w:rPr>
@@ -1361,6 +1436,7 @@
             <w:r>
               <w:rPr>
                 <w:rFonts w:ascii="Consolas" w:hAnsi="Consolas"/>
+                <w:b w:val="0"/>
                 <w:color w:val="8B1E3F"/>
                 <w:sz w:val="17"/>
               </w:rPr>
@@ -1392,6 +1468,7 @@
               <w:rPr>
                 <w:rFonts w:ascii="Consolas" w:hAnsi="Consolas"/>
                 <w:b/>
+                <w:color w:val="8B1E3F"/>
                 <w:sz w:val="17"/>
               </w:rPr>
               <w:t>it.fails</w:t>
@@ -1528,6 +1605,7 @@
         <w:pStyle w:val="Heading1"/>
       </w:pPr>
       <w:r>
+        <w:rPr/>
         <w:t>4. Guion de presentación (≈ 10 minutos)</w:t>
       </w:r>
     </w:p>
@@ -1720,6 +1798,7 @@
             <w:r>
               <w:rPr>
                 <w:rFonts w:ascii="Consolas" w:hAnsi="Consolas"/>
+                <w:b w:val="0"/>
                 <w:color w:val="8B1E3F"/>
                 <w:sz w:val="17"/>
               </w:rPr>
@@ -1734,6 +1813,7 @@
             <w:r>
               <w:rPr>
                 <w:rFonts w:ascii="Consolas" w:hAnsi="Consolas"/>
+                <w:b w:val="0"/>
                 <w:color w:val="8B1E3F"/>
                 <w:sz w:val="17"/>
               </w:rPr>
@@ -1805,6 +1885,7 @@
             <w:r>
               <w:rPr>
                 <w:rFonts w:ascii="Consolas" w:hAnsi="Consolas"/>
+                <w:b w:val="0"/>
                 <w:color w:val="8B1E3F"/>
                 <w:sz w:val="17"/>
               </w:rPr>
@@ -1819,6 +1900,7 @@
             <w:r>
               <w:rPr>
                 <w:rFonts w:ascii="Consolas" w:hAnsi="Consolas"/>
+                <w:b w:val="0"/>
                 <w:color w:val="8B1E3F"/>
                 <w:sz w:val="17"/>
               </w:rPr>
@@ -1833,6 +1915,7 @@
             <w:r>
               <w:rPr>
                 <w:rFonts w:ascii="Consolas" w:hAnsi="Consolas"/>
+                <w:b w:val="0"/>
                 <w:color w:val="8B1E3F"/>
                 <w:sz w:val="17"/>
               </w:rPr>
@@ -1888,7 +1971,7 @@
                 <w:b/>
                 <w:sz w:val="19"/>
               </w:rPr>
-              <w:t>193 aprobadas + 5 defectos conocidos</w:t>
+              <w:t>195 aprobadas + 3 defectos conocidos</w:t>
             </w:r>
             <w:r>
               <w:rPr>
@@ -1910,6 +1993,7 @@
             <w:r>
               <w:rPr>
                 <w:rFonts w:ascii="Consolas" w:hAnsi="Consolas"/>
+                <w:b w:val="0"/>
                 <w:color w:val="8B1E3F"/>
                 <w:sz w:val="17"/>
               </w:rPr>
@@ -2132,6 +2216,7 @@
         <w:pStyle w:val="Heading1"/>
       </w:pPr>
       <w:r>
+        <w:rPr/>
         <w:t>5. Demo en vivo: cambio → rojo → arreglo → verde</w:t>
       </w:r>
     </w:p>
@@ -2173,7 +2258,7 @@
           <w:rFonts w:ascii="Consolas" w:hAnsi="Consolas" w:eastAsia="Consolas"/>
           <w:sz w:val="17"/>
         </w:rPr>
-        <w:t># Tests  193 passed | 5 expected fail (198)</w:t>
+        <w:t># Tests  195 passed | 3 expected fail (198)</w:t>
       </w:r>
     </w:p>
     <w:p>
@@ -2184,17 +2269,20 @@
         <w:t>Paso 2 — introducir un error</w:t>
       </w:r>
       <w:r>
+        <w:rPr/>
         <w:t xml:space="preserve"> en </w:t>
       </w:r>
       <w:r>
         <w:rPr>
           <w:rFonts w:ascii="Consolas" w:hAnsi="Consolas"/>
+          <w:b w:val="0"/>
           <w:color w:val="8B1E3F"/>
           <w:sz w:val="19"/>
         </w:rPr>
         <w:t>backend/src/application/use-cases/pocket/DeletePocket.ts</w:t>
       </w:r>
       <w:r>
+        <w:rPr/>
         <w:t>:</w:t>
       </w:r>
     </w:p>
@@ -2293,7 +2381,7 @@
           <w:rFonts w:ascii="Consolas" w:hAnsi="Consolas" w:eastAsia="Consolas"/>
           <w:sz w:val="17"/>
         </w:rPr>
-        <w:t>Tests  4 failed | 189 passed | 5 expected fail (198)</w:t>
+        <w:t>Tests  4 failed | 191 passed | 3 expected fail (198)</w:t>
       </w:r>
     </w:p>
     <w:p>
@@ -2304,26 +2392,30 @@
         <w:t>Paso 4 — revertir</w:t>
       </w:r>
       <w:r>
+        <w:rPr/>
         <w:t xml:space="preserve"> (</w:t>
       </w:r>
       <w:r>
         <w:rPr>
           <w:rFonts w:ascii="Consolas" w:hAnsi="Consolas"/>
+          <w:b w:val="0"/>
           <w:color w:val="8B1E3F"/>
           <w:sz w:val="19"/>
         </w:rPr>
         <w:t>git checkout -- src/application/use-cases/pocket/DeletePocket.ts</w:t>
       </w:r>
       <w:r>
+        <w:rPr/>
         <w:t xml:space="preserve">) y volver a ejecutar: </w:t>
       </w:r>
       <w:r>
         <w:rPr>
           <w:b/>
         </w:rPr>
-        <w:t>193 passed | 5 expected fail</w:t>
+        <w:t>195 passed | 3 expected fail</w:t>
       </w:r>
       <w:r>
+        <w:rPr/>
         <w:t>.</w:t>
       </w:r>
     </w:p>
@@ -2335,28 +2427,33 @@
         <w:t>Alternativa con la sexta funcionalidad:</w:t>
       </w:r>
       <w:r>
+        <w:rPr/>
         <w:t xml:space="preserve"> en </w:t>
       </w:r>
       <w:r>
         <w:rPr>
           <w:rFonts w:ascii="Consolas" w:hAnsi="Consolas"/>
+          <w:b w:val="0"/>
           <w:color w:val="8B1E3F"/>
           <w:sz w:val="19"/>
         </w:rPr>
         <w:t>DepositMoney.ts</w:t>
       </w:r>
       <w:r>
+        <w:rPr/>
         <w:t xml:space="preserve">, comentar </w:t>
       </w:r>
       <w:r>
         <w:rPr>
           <w:rFonts w:ascii="Consolas" w:hAnsi="Consolas"/>
+          <w:b w:val="0"/>
           <w:color w:val="8B1E3F"/>
           <w:sz w:val="19"/>
         </w:rPr>
         <w:t>account.assertBelongsTo(dto.userId);</w:t>
       </w:r>
       <w:r>
+        <w:rPr/>
         <w:t xml:space="preserve">. Fallan </w:t>
       </w:r>
       <w:r>
@@ -2366,11 +2463,13 @@
         <w:t>2 pruebas</w:t>
       </w:r>
       <w:r>
+        <w:rPr/>
         <w:t>: la unitaria de FORBIDDEN y RG-DE-12, porque cualquiera podría depositar en una cuenta ajena.</w:t>
       </w:r>
     </w:p>
     <w:p>
       <w:r>
+        <w:rPr/>
         <w:t>Otros cambios verificados:</w:t>
       </w:r>
     </w:p>
@@ -2446,6 +2545,7 @@
             <w:r>
               <w:rPr>
                 <w:rFonts w:ascii="Consolas" w:hAnsi="Consolas"/>
+                <w:b w:val="0"/>
                 <w:color w:val="8B1E3F"/>
                 <w:sz w:val="17"/>
               </w:rPr>
@@ -2493,6 +2593,7 @@
             <w:r>
               <w:rPr>
                 <w:rFonts w:ascii="Consolas" w:hAnsi="Consolas"/>
+                <w:b w:val="0"/>
                 <w:color w:val="8B1E3F"/>
                 <w:sz w:val="17"/>
               </w:rPr>
@@ -2507,6 +2608,7 @@
             <w:r>
               <w:rPr>
                 <w:rFonts w:ascii="Consolas" w:hAnsi="Consolas"/>
+                <w:b w:val="0"/>
                 <w:color w:val="8B1E3F"/>
                 <w:sz w:val="17"/>
               </w:rPr>
@@ -2521,6 +2623,7 @@
             <w:r>
               <w:rPr>
                 <w:rFonts w:ascii="Consolas" w:hAnsi="Consolas"/>
+                <w:b w:val="0"/>
                 <w:color w:val="8B1E3F"/>
                 <w:sz w:val="17"/>
               </w:rPr>
@@ -2568,6 +2671,7 @@
             <w:r>
               <w:rPr>
                 <w:rFonts w:ascii="Consolas" w:hAnsi="Consolas"/>
+                <w:b w:val="0"/>
                 <w:color w:val="8B1E3F"/>
                 <w:sz w:val="17"/>
               </w:rPr>
@@ -2582,6 +2686,7 @@
             <w:r>
               <w:rPr>
                 <w:rFonts w:ascii="Consolas" w:hAnsi="Consolas"/>
+                <w:b w:val="0"/>
                 <w:color w:val="8B1E3F"/>
                 <w:sz w:val="17"/>
               </w:rPr>
@@ -2596,6 +2701,7 @@
             <w:r>
               <w:rPr>
                 <w:rFonts w:ascii="Consolas" w:hAnsi="Consolas"/>
+                <w:b w:val="0"/>
                 <w:color w:val="8B1E3F"/>
                 <w:sz w:val="17"/>
               </w:rPr>
@@ -2628,6 +2734,7 @@
             <w:r>
               <w:rPr>
                 <w:rFonts w:ascii="Consolas" w:hAnsi="Consolas"/>
+                <w:b w:val="0"/>
                 <w:color w:val="8B1E3F"/>
                 <w:sz w:val="17"/>
               </w:rPr>
@@ -2661,6 +2768,7 @@
         <w:pStyle w:val="Heading1"/>
       </w:pPr>
       <w:r>
+        <w:rPr/>
         <w:t>6. Evidencia antes vs después</w:t>
       </w:r>
     </w:p>
@@ -2676,17 +2784,20 @@
         <w:t>Antes:</w:t>
       </w:r>
       <w:r>
+        <w:rPr/>
         <w:t xml:space="preserve"> </w:t>
       </w:r>
       <w:r>
         <w:rPr>
           <w:rFonts w:ascii="Consolas" w:hAnsi="Consolas"/>
+          <w:b w:val="0"/>
           <w:color w:val="8B1E3F"/>
           <w:sz w:val="19"/>
         </w:rPr>
         <w:t>6102a28</w:t>
       </w:r>
       <w:r>
+        <w:rPr/>
         <w:t>, código previo a cualquier refactor.</w:t>
       </w:r>
     </w:p>
@@ -2702,28 +2813,33 @@
         <w:t>Después:</w:t>
       </w:r>
       <w:r>
+        <w:rPr/>
         <w:t xml:space="preserve"> rama del pipeline (</w:t>
       </w:r>
       <w:r>
         <w:rPr>
           <w:rFonts w:ascii="Consolas" w:hAnsi="Consolas"/>
+          <w:b w:val="0"/>
           <w:color w:val="8B1E3F"/>
           <w:sz w:val="19"/>
         </w:rPr>
         <w:t>devops/jenkins-gitops</w:t>
       </w:r>
       <w:r>
+        <w:rPr/>
         <w:t xml:space="preserve">, </w:t>
       </w:r>
       <w:r>
         <w:rPr>
           <w:rFonts w:ascii="Consolas" w:hAnsi="Consolas"/>
+          <w:b w:val="0"/>
           <w:color w:val="8B1E3F"/>
           <w:sz w:val="19"/>
         </w:rPr>
         <w:t>3205dc1</w:t>
       </w:r>
       <w:r>
+        <w:rPr/>
         <w:t>). Incluye:</w:t>
       </w:r>
     </w:p>
@@ -2733,17 +2849,20 @@
         <w:spacing w:after="60"/>
       </w:pPr>
       <w:r>
+        <w:rPr/>
         <w:t xml:space="preserve">el refactor de </w:t>
       </w:r>
       <w:r>
         <w:rPr>
           <w:rFonts w:ascii="Consolas" w:hAnsi="Consolas"/>
+          <w:b w:val="0"/>
           <w:color w:val="8B1E3F"/>
           <w:sz w:val="19"/>
         </w:rPr>
         <w:t>UpdatePocket</w:t>
       </w:r>
       <w:r>
+        <w:rPr/>
         <w:t xml:space="preserve"> (cognitiva 16 → 6);</w:t>
       </w:r>
     </w:p>
@@ -2755,12 +2874,14 @@
       <w:r>
         <w:rPr>
           <w:rFonts w:ascii="Consolas" w:hAnsi="Consolas"/>
+          <w:b w:val="0"/>
           <w:color w:val="8B1E3F"/>
           <w:sz w:val="19"/>
         </w:rPr>
         <w:t>node:crypto</w:t>
       </w:r>
       <w:r>
+        <w:rPr/>
         <w:t xml:space="preserve"> en los casos de uso;</w:t>
       </w:r>
     </w:p>
@@ -2772,12 +2893,14 @@
       <w:r>
         <w:rPr>
           <w:rFonts w:ascii="Consolas" w:hAnsi="Consolas"/>
+          <w:b w:val="0"/>
           <w:color w:val="8B1E3F"/>
           <w:sz w:val="19"/>
         </w:rPr>
         <w:t>z.uuid()</w:t>
       </w:r>
       <w:r>
+        <w:rPr/>
         <w:t xml:space="preserve"> de zod 4 en los validadores.</w:t>
       </w:r>
     </w:p>
@@ -2793,6 +2916,7 @@
         <w:t>Procedimiento:</w:t>
       </w:r>
       <w:r>
+        <w:rPr/>
         <w:t xml:space="preserve"> </w:t>
       </w:r>
       <w:r>
@@ -2802,6 +2926,7 @@
         <w:t>git worktree</w:t>
       </w:r>
       <w:r>
+        <w:rPr/>
         <w:t xml:space="preserve"> con el código viejo + </w:t>
       </w:r>
       <w:r>
@@ -2811,6 +2936,7 @@
         <w:t>el mismo paquete de pruebas</w:t>
       </w:r>
       <w:r>
+        <w:rPr/>
         <w:t>, ejecución con reporte JSON y comparación caso por caso.</w:t>
       </w:r>
     </w:p>
@@ -2826,6 +2952,7 @@
         <w:t>Resultado:</w:t>
       </w:r>
       <w:r>
+        <w:rPr/>
         <w:t xml:space="preserve"> 18 archivos, </w:t>
       </w:r>
       <w:r>
@@ -2835,17 +2962,20 @@
         <w:t>198 casos, 0 diferencias</w:t>
       </w:r>
       <w:r>
+        <w:rPr/>
         <w:t xml:space="preserve"> (193 aprobados + 5 </w:t>
       </w:r>
       <w:r>
         <w:rPr>
           <w:rFonts w:ascii="Consolas" w:hAnsi="Consolas"/>
+          <w:b w:val="0"/>
           <w:color w:val="8B1E3F"/>
           <w:sz w:val="19"/>
         </w:rPr>
         <w:t>it.fails</w:t>
       </w:r>
       <w:r>
+        <w:rPr/>
         <w:t xml:space="preserve"> en ambos).</w:t>
       </w:r>
     </w:p>
@@ -2861,50 +2991,59 @@
         <w:t>Archivos:</w:t>
       </w:r>
       <w:r>
+        <w:rPr/>
         <w:t xml:space="preserve"> </w:t>
       </w:r>
       <w:r>
         <w:rPr>
           <w:rFonts w:ascii="Consolas" w:hAnsi="Consolas"/>
+          <w:b w:val="0"/>
           <w:color w:val="8B1E3F"/>
           <w:sz w:val="19"/>
         </w:rPr>
         <w:t>docs/evidencia-regresion-bolsillos/antes-6102a28.txt</w:t>
       </w:r>
       <w:r>
+        <w:rPr/>
         <w:t xml:space="preserve">, </w:t>
       </w:r>
       <w:r>
         <w:rPr>
           <w:rFonts w:ascii="Consolas" w:hAnsi="Consolas"/>
+          <w:b w:val="0"/>
           <w:color w:val="8B1E3F"/>
           <w:sz w:val="19"/>
         </w:rPr>
         <w:t>despues-rama-pipeline.txt</w:t>
       </w:r>
       <w:r>
+        <w:rPr/>
         <w:t xml:space="preserve">, </w:t>
       </w:r>
       <w:r>
         <w:rPr>
           <w:rFonts w:ascii="Consolas" w:hAnsi="Consolas"/>
+          <w:b w:val="0"/>
           <w:color w:val="8B1E3F"/>
           <w:sz w:val="19"/>
         </w:rPr>
         <w:t>comparacion.json</w:t>
       </w:r>
       <w:r>
+        <w:rPr/>
         <w:t xml:space="preserve"> y </w:t>
       </w:r>
       <w:r>
         <w:rPr>
           <w:rFonts w:ascii="Consolas" w:hAnsi="Consolas"/>
+          <w:b w:val="0"/>
           <w:color w:val="8B1E3F"/>
           <w:sz w:val="19"/>
         </w:rPr>
         <w:t>diff-produccion-antes-despues.patch</w:t>
       </w:r>
       <w:r>
+        <w:rPr/>
         <w:t>.</w:t>
       </w:r>
     </w:p>
@@ -2921,6 +3060,7 @@
         <w:pStyle w:val="Heading1"/>
       </w:pPr>
       <w:r>
+        <w:rPr/>
         <w:t>7. Integración continua</w:t>
       </w:r>
     </w:p>
@@ -3065,6 +3205,7 @@
             <w:r>
               <w:rPr>
                 <w:rFonts w:ascii="Consolas" w:hAnsi="Consolas"/>
+                <w:b w:val="0"/>
                 <w:color w:val="8B1E3F"/>
                 <w:sz w:val="17"/>
               </w:rPr>
@@ -3079,6 +3220,7 @@
             <w:r>
               <w:rPr>
                 <w:rFonts w:ascii="Consolas" w:hAnsi="Consolas"/>
+                <w:b w:val="0"/>
                 <w:color w:val="8B1E3F"/>
                 <w:sz w:val="17"/>
               </w:rPr>
@@ -3132,6 +3274,7 @@
             <w:r>
               <w:rPr>
                 <w:rFonts w:ascii="Consolas" w:hAnsi="Consolas"/>
+                <w:b w:val="0"/>
                 <w:color w:val="8B1E3F"/>
                 <w:sz w:val="17"/>
               </w:rPr>
@@ -3146,6 +3289,7 @@
             <w:r>
               <w:rPr>
                 <w:rFonts w:ascii="Consolas" w:hAnsi="Consolas"/>
+                <w:b w:val="0"/>
                 <w:color w:val="8B1E3F"/>
                 <w:sz w:val="17"/>
               </w:rPr>
@@ -3193,6 +3337,7 @@
             <w:r>
               <w:rPr>
                 <w:rFonts w:ascii="Consolas" w:hAnsi="Consolas"/>
+                <w:b w:val="0"/>
                 <w:color w:val="8B1E3F"/>
                 <w:sz w:val="17"/>
               </w:rPr>
@@ -3207,6 +3352,7 @@
             <w:r>
               <w:rPr>
                 <w:rFonts w:ascii="Consolas" w:hAnsi="Consolas"/>
+                <w:b w:val="0"/>
                 <w:color w:val="8B1E3F"/>
                 <w:sz w:val="17"/>
               </w:rPr>
@@ -3260,6 +3406,7 @@
             <w:r>
               <w:rPr>
                 <w:rFonts w:ascii="Consolas" w:hAnsi="Consolas"/>
+                <w:b w:val="0"/>
                 <w:color w:val="8B1E3F"/>
                 <w:sz w:val="17"/>
               </w:rPr>
@@ -3334,6 +3481,7 @@
               <w:rPr>
                 <w:rFonts w:ascii="Consolas" w:hAnsi="Consolas"/>
                 <w:b/>
+                <w:color w:val="8B1E3F"/>
                 <w:sz w:val="17"/>
               </w:rPr>
               <w:t>it.fails</w:t>
@@ -3347,6 +3495,7 @@
             <w:r>
               <w:rPr>
                 <w:rFonts w:ascii="Consolas" w:hAnsi="Consolas"/>
+                <w:b w:val="0"/>
                 <w:color w:val="8B1E3F"/>
                 <w:sz w:val="17"/>
               </w:rPr>
@@ -3383,6 +3532,7 @@
             <w:r>
               <w:rPr>
                 <w:rFonts w:ascii="Consolas" w:hAnsi="Consolas"/>
+                <w:b w:val="0"/>
                 <w:color w:val="8B1E3F"/>
                 <w:sz w:val="17"/>
               </w:rPr>
@@ -3397,6 +3547,7 @@
             <w:r>
               <w:rPr>
                 <w:rFonts w:ascii="Consolas" w:hAnsi="Consolas"/>
+                <w:b w:val="0"/>
                 <w:color w:val="8B1E3F"/>
                 <w:sz w:val="17"/>
               </w:rPr>
@@ -3428,6 +3579,7 @@
             <w:r>
               <w:rPr>
                 <w:rFonts w:ascii="Consolas" w:hAnsi="Consolas"/>
+                <w:b w:val="0"/>
                 <w:color w:val="8B1E3F"/>
                 <w:sz w:val="17"/>
               </w:rPr>
@@ -3442,6 +3594,7 @@
             <w:r>
               <w:rPr>
                 <w:rFonts w:ascii="Consolas" w:hAnsi="Consolas"/>
+                <w:b w:val="0"/>
                 <w:color w:val="8B1E3F"/>
                 <w:sz w:val="17"/>
               </w:rPr>
@@ -3456,6 +3609,7 @@
             <w:r>
               <w:rPr>
                 <w:rFonts w:ascii="Consolas" w:hAnsi="Consolas"/>
+                <w:b w:val="0"/>
                 <w:color w:val="8B1E3F"/>
                 <w:sz w:val="17"/>
               </w:rPr>
@@ -3484,17 +3638,20 @@
         <w:t>Debilidad que me pueden preguntar:</w:t>
       </w:r>
       <w:r>
+        <w:rPr/>
         <w:t xml:space="preserve"> la etapa de pruebas usa </w:t>
       </w:r>
       <w:r>
         <w:rPr>
           <w:rFonts w:ascii="Consolas" w:hAnsi="Consolas"/>
+          <w:b w:val="0"/>
           <w:color w:val="8B1E3F"/>
           <w:sz w:val="19"/>
         </w:rPr>
         <w:t>npm run test:coverage || ... || echo "WARN"</w:t>
       </w:r>
       <w:r>
+        <w:rPr/>
         <w:t xml:space="preserve">, así que </w:t>
       </w:r>
       <w:r>
@@ -3504,6 +3661,7 @@
         <w:t>una prueba roja no detiene el pipeline</w:t>
       </w:r>
       <w:r>
+        <w:rPr/>
         <w:t xml:space="preserve">; lo detiene el </w:t>
       </w:r>
       <w:r>
@@ -3513,28 +3671,33 @@
         <w:t>Quality Gate</w:t>
       </w:r>
       <w:r>
+        <w:rPr/>
         <w:t xml:space="preserve"> de SonarQube. Mejora propuesta: quitar el </w:t>
       </w:r>
       <w:r>
         <w:rPr>
           <w:rFonts w:ascii="Consolas" w:hAnsi="Consolas"/>
+          <w:b w:val="0"/>
           <w:color w:val="8B1E3F"/>
           <w:sz w:val="19"/>
         </w:rPr>
         <w:t>|| echo</w:t>
       </w:r>
       <w:r>
+        <w:rPr/>
         <w:t xml:space="preserve"> o agregar una etapa </w:t>
       </w:r>
       <w:r>
         <w:rPr>
           <w:rFonts w:ascii="Consolas" w:hAnsi="Consolas"/>
+          <w:b w:val="0"/>
           <w:color w:val="8B1E3F"/>
           <w:sz w:val="19"/>
         </w:rPr>
         <w:t>npm run test:regression:bolsillos</w:t>
       </w:r>
       <w:r>
+        <w:rPr/>
         <w:t xml:space="preserve"> sin tolerancia a fallos.</w:t>
       </w:r>
     </w:p>
@@ -3551,6 +3714,7 @@
         <w:pStyle w:val="Heading1"/>
       </w:pPr>
       <w:r>
+        <w:rPr/>
         <w:t>8. Preguntas probables y respuestas</w:t>
       </w:r>
     </w:p>
@@ -3562,6 +3726,7 @@
         <w:t>¿Por qué el depósito como sexta funcionalidad?</w:t>
       </w:r>
       <w:r>
+        <w:rPr/>
         <w:t xml:space="preserve"> Revisé autores, ramas y pruebas del repo. Créditos es de Andrés; autenticación y perfil, de Tomás; tarjetas, de Dubin. Cuentas no tenía pruebas de nadie. Además el depósito alimenta el saldo disponible que usan los bolsillos, y lo pruebo con RG-DE-15.</w:t>
       </w:r>
     </w:p>
@@ -3573,6 +3738,7 @@
         <w:t>¿Por qué Chai y no "Fluent Assertions"?</w:t>
       </w:r>
       <w:r>
+        <w:rPr/>
         <w:t xml:space="preserve"> FluentAssertions es de .NET. En JS/TS el estándar de aserciones fluidas es Chai BDD, y Vitest ya lo trae: no agregué dependencias.</w:t>
       </w:r>
     </w:p>
@@ -3584,17 +3750,20 @@
         <w:t>¿Qué ganas con las aserciones fluidas?</w:t>
       </w:r>
       <w:r>
+        <w:rPr/>
         <w:t xml:space="preserve"> Se leen como una frase, agrupan condiciones sobre el mismo objeto en una sola cadena y dan mensajes de fallo más claros (</w:t>
       </w:r>
       <w:r>
         <w:rPr>
           <w:rFonts w:ascii="Consolas" w:hAnsi="Consolas"/>
+          <w:b w:val="0"/>
           <w:color w:val="8B1E3F"/>
           <w:sz w:val="19"/>
         </w:rPr>
         <w:t>expected 201 to equal 400</w:t>
       </w:r>
       <w:r>
+        <w:rPr/>
         <w:t>).</w:t>
       </w:r>
     </w:p>
@@ -3606,17 +3775,20 @@
         <w:t>¿Cambiaste lo que verificaban las pruebas existentes?</w:t>
       </w:r>
       <w:r>
+        <w:rPr/>
         <w:t xml:space="preserve"> No, solo el estilo. Excepción: las de la entidad </w:t>
       </w:r>
       <w:r>
         <w:rPr>
           <w:rFonts w:ascii="Consolas" w:hAnsi="Consolas"/>
+          <w:b w:val="0"/>
           <w:color w:val="8B1E3F"/>
           <w:sz w:val="19"/>
         </w:rPr>
         <w:t>Pocket</w:t>
       </w:r>
       <w:r>
+        <w:rPr/>
         <w:t>, que ahora también verifican tipo y código del error.</w:t>
       </w:r>
     </w:p>
@@ -3628,6 +3800,7 @@
         <w:t>¿Por qué regresión a nivel API?</w:t>
       </w:r>
       <w:r>
+        <w:rPr/>
         <w:t xml:space="preserve"> Protege el comportamiento que consume el frontend (códigos HTTP, forma del JSON, mensajes de error). Una unitaria no detecta un cambio en el validador ni en el manejador de errores.</w:t>
       </w:r>
     </w:p>
@@ -3639,17 +3812,20 @@
         <w:t>¿Por qué no Supabase real?</w:t>
       </w:r>
       <w:r>
+        <w:rPr/>
         <w:t xml:space="preserve"> Por repetibilidad y velocidad (≈ 4 s, sin red), y para no depender de la tabla </w:t>
       </w:r>
       <w:r>
         <w:rPr>
           <w:rFonts w:ascii="Consolas" w:hAnsi="Consolas"/>
+          <w:b w:val="0"/>
           <w:color w:val="8B1E3F"/>
           <w:sz w:val="19"/>
         </w:rPr>
         <w:t>pockets</w:t>
       </w:r>
       <w:r>
+        <w:rPr/>
         <w:t>, que no existe (defecto D-07).</w:t>
       </w:r>
     </w:p>
@@ -3661,6 +3837,7 @@
         <w:t>¿Qué son los 5 "expected fail"?</w:t>
       </w:r>
       <w:r>
+        <w:rPr/>
         <w:t xml:space="preserve"> Defectos conocidos: D-01/03 (nombre vacío), D-02 (booleano en bolsillos), D-04 (monto como texto al actualizar), D-05 (saldo contado dos veces) y D-08 (booleano en el depósito). Verifiqué que cada uno falla justo en la aserción del defecto.</w:t>
       </w:r>
     </w:p>
@@ -3672,6 +3849,7 @@
         <w:t>¿Cómo sabes que la suite detecta errores?</w:t>
       </w:r>
       <w:r>
+        <w:rPr/>
         <w:t xml:space="preserve"> Por la demo: introduje cuatro errores distintos y todos se detectaron. El único cambio no detectado es un mutante equivalente, que no altera el comportamiento.</w:t>
       </w:r>
     </w:p>
@@ -3689,17 +3867,20 @@
         <w:spacing w:after="60"/>
       </w:pPr>
       <w:r>
+        <w:rPr/>
         <w:t xml:space="preserve">El depósito acepta </w:t>
       </w:r>
       <w:r>
         <w:rPr>
           <w:rFonts w:ascii="Consolas" w:hAnsi="Consolas"/>
+          <w:b w:val="0"/>
           <w:color w:val="8B1E3F"/>
           <w:sz w:val="19"/>
         </w:rPr>
         <w:t>true</w:t>
       </w:r>
       <w:r>
+        <w:rPr/>
         <w:t xml:space="preserve"> como $1 (D-08).</w:t>
       </w:r>
     </w:p>
@@ -3709,6 +3890,7 @@
         <w:spacing w:after="60"/>
       </w:pPr>
       <w:r>
+        <w:rPr/>
         <w:t>Ignora la descripción y no registra una transacción.</w:t>
       </w:r>
     </w:p>
@@ -3718,6 +3900,7 @@
         <w:spacing w:after="60"/>
       </w:pPr>
       <w:r>
+        <w:rPr/>
         <w:t>Usa códigos de error distintos a Bolsillos para el mismo problema.</w:t>
       </w:r>
     </w:p>
@@ -3727,17 +3910,20 @@
         <w:spacing w:after="60"/>
       </w:pPr>
       <w:r>
+        <w:rPr/>
         <w:t xml:space="preserve">En </w:t>
       </w:r>
       <w:r>
         <w:rPr>
           <w:rFonts w:ascii="Consolas" w:hAnsi="Consolas"/>
+          <w:b w:val="0"/>
           <w:color w:val="8B1E3F"/>
           <w:sz w:val="19"/>
         </w:rPr>
         <w:t>main</w:t>
       </w:r>
       <w:r>
+        <w:rPr/>
         <w:t xml:space="preserve"> estaba mal cableado; la rama del pipeline lo corrigió.</w:t>
       </w:r>
     </w:p>
@@ -3749,6 +3935,7 @@
         <w:t>¿Qué cobertura tienen?</w:t>
       </w:r>
       <w:r>
+        <w:rPr/>
         <w:t xml:space="preserve"> Los 9 archivos de las seis funcionalidades quedan al </w:t>
       </w:r>
       <w:r>
@@ -3758,6 +3945,7 @@
         <w:t>100 %</w:t>
       </w:r>
       <w:r>
+        <w:rPr/>
         <w:t xml:space="preserve"> de líneas, ramas y funciones. El backend completo, al 99,6 %.</w:t>
       </w:r>
     </w:p>
@@ -3774,6 +3962,7 @@
         <w:pStyle w:val="Heading1"/>
       </w:pPr>
       <w:r>
+        <w:rPr/>
         <w:t>9. Comandos para la sustentación</w:t>
       </w:r>
     </w:p>
@@ -3847,6 +4036,7 @@
         <w:pStyle w:val="Heading1"/>
       </w:pPr>
       <w:r>
+        <w:rPr/>
         <w:t>10. Archivos para mostrar</w:t>
       </w:r>
     </w:p>
@@ -3939,6 +4129,7 @@
             <w:r>
               <w:rPr>
                 <w:rFonts w:ascii="Consolas" w:hAnsi="Consolas"/>
+                <w:b w:val="0"/>
                 <w:color w:val="8B1E3F"/>
                 <w:sz w:val="17"/>
               </w:rPr>
@@ -3980,6 +4171,7 @@
             <w:r>
               <w:rPr>
                 <w:rFonts w:ascii="Consolas" w:hAnsi="Consolas"/>
+                <w:b w:val="0"/>
                 <w:color w:val="8B1E3F"/>
                 <w:sz w:val="17"/>
               </w:rPr>
@@ -4021,6 +4213,7 @@
             <w:r>
               <w:rPr>
                 <w:rFonts w:ascii="Consolas" w:hAnsi="Consolas"/>
+                <w:b w:val="0"/>
                 <w:color w:val="8B1E3F"/>
                 <w:sz w:val="17"/>
               </w:rPr>
@@ -4035,6 +4228,7 @@
             <w:r>
               <w:rPr>
                 <w:rFonts w:ascii="Consolas" w:hAnsi="Consolas"/>
+                <w:b w:val="0"/>
                 <w:color w:val="8B1E3F"/>
                 <w:sz w:val="17"/>
               </w:rPr>
@@ -4076,6 +4270,7 @@
             <w:r>
               <w:rPr>
                 <w:rFonts w:ascii="Consolas" w:hAnsi="Consolas"/>
+                <w:b w:val="0"/>
                 <w:color w:val="8B1E3F"/>
                 <w:sz w:val="17"/>
               </w:rPr>
@@ -4117,6 +4312,7 @@
             <w:r>
               <w:rPr>
                 <w:rFonts w:ascii="Consolas" w:hAnsi="Consolas"/>
+                <w:b w:val="0"/>
                 <w:color w:val="8B1E3F"/>
                 <w:sz w:val="17"/>
               </w:rPr>
@@ -4131,6 +4327,7 @@
             <w:r>
               <w:rPr>
                 <w:rFonts w:ascii="Consolas" w:hAnsi="Consolas"/>
+                <w:b w:val="0"/>
                 <w:color w:val="8B1E3F"/>
                 <w:sz w:val="17"/>
               </w:rPr>
@@ -4172,6 +4369,7 @@
             <w:r>
               <w:rPr>
                 <w:rFonts w:ascii="Consolas" w:hAnsi="Consolas"/>
+                <w:b w:val="0"/>
                 <w:color w:val="8B1E3F"/>
                 <w:sz w:val="17"/>
               </w:rPr>
@@ -4213,6 +4411,7 @@
             <w:r>
               <w:rPr>
                 <w:rFonts w:ascii="Consolas" w:hAnsi="Consolas"/>
+                <w:b w:val="0"/>
                 <w:color w:val="8B1E3F"/>
                 <w:sz w:val="17"/>
               </w:rPr>
@@ -4254,6 +4453,7 @@
             <w:r>
               <w:rPr>
                 <w:rFonts w:ascii="Consolas" w:hAnsi="Consolas"/>
+                <w:b w:val="0"/>
                 <w:color w:val="8B1E3F"/>
                 <w:sz w:val="17"/>
               </w:rPr>
@@ -4268,6 +4468,7 @@
             <w:r>
               <w:rPr>
                 <w:rFonts w:ascii="Consolas" w:hAnsi="Consolas"/>
+                <w:b w:val="0"/>
                 <w:color w:val="8B1E3F"/>
                 <w:sz w:val="17"/>
               </w:rPr>
@@ -5232,9 +5433,6 @@
       </w:numPr>
       <w:contextualSpacing/>
     </w:pPr>
-    <w:rPr>
-      <w:sz w:val="21"/>
-    </w:rPr>
   </w:style>
   <w:style w:type="paragraph" w:styleId="ListBullet2">
     <w:name w:val="List Bullet 2"/>
@@ -5274,9 +5472,6 @@
       </w:numPr>
       <w:contextualSpacing/>
     </w:pPr>
-    <w:rPr>
-      <w:sz w:val="21"/>
-    </w:rPr>
   </w:style>
   <w:style w:type="paragraph" w:styleId="ListNumber2">
     <w:name w:val="List Number 2"/>

</xml_diff>